<commit_message>
Modified 1 file, removed a temp file
</commit_message>
<xml_diff>
--- a/FC723 Portfolio assigment 1/Documentation/euclidean_algorithm_report.docx
+++ b/FC723 Portfolio assigment 1/Documentation/euclidean_algorithm_report.docx
@@ -285,84 +285,6 @@
         <w:tabs>
           <w:tab w:val="left" w:pos="1216"/>
         </w:tabs>
-        <w:rPr>
-          <w:sz w:val="18"/>
-          <w:szCs w:val="18"/>
-        </w:rPr>
-      </w:pPr>
-    </w:p>
-    <w:p>
-      <w:pPr>
-        <w:tabs>
-          <w:tab w:val="left" w:pos="1216"/>
-        </w:tabs>
-        <w:jc w:val="center"/>
-        <w:rPr>
-          <w:b/>
-          <w:bCs/>
-          <w:sz w:val="28"/>
-          <w:szCs w:val="28"/>
-        </w:rPr>
-      </w:pPr>
-      <w:r>
-        <w:rPr>
-          <w:b/>
-          <w:bCs/>
-          <w:sz w:val="28"/>
-          <w:szCs w:val="28"/>
-        </w:rPr>
-        <w:t xml:space="preserve">GitHub Repository </w:t>
-      </w:r>
-      <w:r>
-        <w:rPr>
-          <w:b/>
-          <w:bCs/>
-          <w:sz w:val="28"/>
-          <w:szCs w:val="28"/>
-        </w:rPr>
-        <w:t>L</w:t>
-      </w:r>
-      <w:r>
-        <w:rPr>
-          <w:b/>
-          <w:bCs/>
-          <w:sz w:val="28"/>
-          <w:szCs w:val="28"/>
-        </w:rPr>
-        <w:t>ink:</w:t>
-      </w:r>
-      <w:r>
-        <w:t xml:space="preserve"> </w:t>
-      </w:r>
-      <w:hyperlink r:id="rId4" w:history="1">
-        <w:r>
-          <w:rPr>
-            <w:rStyle w:val="Hyperlink"/>
-            <w:b/>
-            <w:bCs/>
-            <w:sz w:val="28"/>
-            <w:szCs w:val="28"/>
-          </w:rPr>
-          <w:t>https://github.com/Sb3ai/FC723-Portfolio-Project-1.git</w:t>
-        </w:r>
-      </w:hyperlink>
-    </w:p>
-    <w:p>
-      <w:pPr>
-        <w:tabs>
-          <w:tab w:val="left" w:pos="1216"/>
-        </w:tabs>
-        <w:rPr>
-          <w:sz w:val="18"/>
-          <w:szCs w:val="18"/>
-        </w:rPr>
-      </w:pPr>
-    </w:p>
-    <w:p>
-      <w:pPr>
-        <w:tabs>
-          <w:tab w:val="left" w:pos="1216"/>
-        </w:tabs>
         <w:jc w:val="center"/>
         <w:rPr>
           <w:b/>
@@ -422,13 +344,6 @@
         <w:tabs>
           <w:tab w:val="left" w:pos="1216"/>
         </w:tabs>
-      </w:pPr>
-    </w:p>
-    <w:p>
-      <w:pPr>
-        <w:tabs>
-          <w:tab w:val="left" w:pos="1216"/>
-        </w:tabs>
         <w:jc w:val="center"/>
         <w:rPr>
           <w:b/>
@@ -701,7 +616,6 @@
           <w:sz w:val="18"/>
           <w:szCs w:val="18"/>
         </w:rPr>
-        <w:lastRenderedPageBreak/>
         <w:tab/>
       </w:r>
       <w:proofErr w:type="spellStart"/>
@@ -783,6 +697,17 @@
         </w:rPr>
         <w:t xml:space="preserve">END </w:t>
       </w:r>
+    </w:p>
+    <w:p>
+      <w:pPr>
+        <w:tabs>
+          <w:tab w:val="left" w:pos="1216"/>
+        </w:tabs>
+        <w:rPr>
+          <w:sz w:val="18"/>
+          <w:szCs w:val="18"/>
+        </w:rPr>
+      </w:pPr>
     </w:p>
     <w:p>
       <w:pPr>
@@ -807,6 +732,7 @@
           <w:sz w:val="28"/>
           <w:szCs w:val="28"/>
         </w:rPr>
+        <w:lastRenderedPageBreak/>
         <w:t>Extension Pseudocode</w:t>
       </w:r>
     </w:p>
@@ -1093,6 +1019,262 @@
         </w:rPr>
         <w:t>END</w:t>
       </w:r>
+    </w:p>
+    <w:p>
+      <w:pPr>
+        <w:tabs>
+          <w:tab w:val="left" w:pos="5207"/>
+        </w:tabs>
+        <w:rPr>
+          <w:sz w:val="18"/>
+          <w:szCs w:val="18"/>
+        </w:rPr>
+      </w:pPr>
+    </w:p>
+    <w:p>
+      <w:pPr>
+        <w:tabs>
+          <w:tab w:val="left" w:pos="5207"/>
+        </w:tabs>
+        <w:rPr>
+          <w:sz w:val="18"/>
+          <w:szCs w:val="18"/>
+        </w:rPr>
+      </w:pPr>
+    </w:p>
+    <w:p>
+      <w:pPr>
+        <w:tabs>
+          <w:tab w:val="left" w:pos="5207"/>
+        </w:tabs>
+        <w:rPr>
+          <w:sz w:val="18"/>
+          <w:szCs w:val="18"/>
+        </w:rPr>
+      </w:pPr>
+    </w:p>
+    <w:p>
+      <w:pPr>
+        <w:pStyle w:val="NormalWeb"/>
+        <w:rPr>
+          <w:rFonts w:ascii="Arial" w:hAnsi="Arial" w:cs="Arial"/>
+        </w:rPr>
+      </w:pPr>
+      <w:r>
+        <w:rPr>
+          <w:rFonts w:ascii="Arial" w:hAnsi="Arial" w:cs="Arial"/>
+        </w:rPr>
+        <w:t>The project was managed using Git and uploaded to GitHub. A repository was created to store and track the development of the program. The initial version of the program, which implemented the Euclidean Algorithm, was committed first.</w:t>
+      </w:r>
+    </w:p>
+    <w:p>
+      <w:pPr>
+        <w:pStyle w:val="NormalWeb"/>
+        <w:rPr>
+          <w:rFonts w:ascii="Arial" w:hAnsi="Arial" w:cs="Arial"/>
+        </w:rPr>
+      </w:pPr>
+      <w:r>
+        <w:rPr>
+          <w:rFonts w:ascii="Arial" w:hAnsi="Arial" w:cs="Arial"/>
+        </w:rPr>
+        <w:t>After this, the program was improved by adding user input and validation to ensure that only positive integers are accepted. These changes were saved using another commit.</w:t>
+      </w:r>
+    </w:p>
+    <w:p>
+      <w:pPr>
+        <w:pStyle w:val="NormalWeb"/>
+        <w:rPr>
+          <w:rFonts w:ascii="Arial" w:hAnsi="Arial" w:cs="Arial"/>
+        </w:rPr>
+      </w:pPr>
+      <w:r>
+        <w:rPr>
+          <w:rFonts w:ascii="Arial" w:hAnsi="Arial" w:cs="Arial"/>
+        </w:rPr>
+        <w:t>Finally, an extension was added to the program to check whether two numbers are relatively prime. This was committed as the final version.</w:t>
+      </w:r>
+    </w:p>
+    <w:p>
+      <w:pPr>
+        <w:pStyle w:val="NormalWeb"/>
+        <w:rPr>
+          <w:rFonts w:ascii="Arial" w:hAnsi="Arial" w:cs="Arial"/>
+        </w:rPr>
+      </w:pPr>
+      <w:r>
+        <w:rPr>
+          <w:rFonts w:ascii="Arial" w:hAnsi="Arial" w:cs="Arial"/>
+        </w:rPr>
+        <w:t xml:space="preserve">Git commands such as </w:t>
+      </w:r>
+      <w:r>
+        <w:rPr>
+          <w:rStyle w:val="HTMLCode"/>
+          <w:rFonts w:ascii="Arial" w:eastAsiaTheme="majorEastAsia" w:hAnsi="Arial" w:cs="Arial"/>
+          <w:sz w:val="24"/>
+          <w:szCs w:val="24"/>
+        </w:rPr>
+        <w:t>git add</w:t>
+      </w:r>
+      <w:r>
+        <w:rPr>
+          <w:rFonts w:ascii="Arial" w:hAnsi="Arial" w:cs="Arial"/>
+        </w:rPr>
+        <w:t xml:space="preserve">, </w:t>
+      </w:r>
+      <w:r>
+        <w:rPr>
+          <w:rStyle w:val="HTMLCode"/>
+          <w:rFonts w:ascii="Arial" w:eastAsiaTheme="majorEastAsia" w:hAnsi="Arial" w:cs="Arial"/>
+          <w:sz w:val="24"/>
+          <w:szCs w:val="24"/>
+        </w:rPr>
+        <w:t>git commit</w:t>
+      </w:r>
+      <w:r>
+        <w:rPr>
+          <w:rFonts w:ascii="Arial" w:hAnsi="Arial" w:cs="Arial"/>
+        </w:rPr>
+        <w:t xml:space="preserve">, and </w:t>
+      </w:r>
+      <w:r>
+        <w:rPr>
+          <w:rStyle w:val="HTMLCode"/>
+          <w:rFonts w:ascii="Arial" w:eastAsiaTheme="majorEastAsia" w:hAnsi="Arial" w:cs="Arial"/>
+          <w:sz w:val="24"/>
+          <w:szCs w:val="24"/>
+        </w:rPr>
+        <w:t>git push</w:t>
+      </w:r>
+      <w:r>
+        <w:rPr>
+          <w:rFonts w:ascii="Arial" w:hAnsi="Arial" w:cs="Arial"/>
+        </w:rPr>
+        <w:t xml:space="preserve"> were used to stage, save, and upload changes to the repository. The use of commits allows tracking of changes between versions, and tools such as </w:t>
+      </w:r>
+      <w:r>
+        <w:rPr>
+          <w:rStyle w:val="HTMLCode"/>
+          <w:rFonts w:ascii="Arial" w:eastAsiaTheme="majorEastAsia" w:hAnsi="Arial" w:cs="Arial"/>
+          <w:sz w:val="24"/>
+          <w:szCs w:val="24"/>
+        </w:rPr>
+        <w:t>git diff</w:t>
+      </w:r>
+      <w:r>
+        <w:rPr>
+          <w:rFonts w:ascii="Arial" w:hAnsi="Arial" w:cs="Arial"/>
+        </w:rPr>
+        <w:t xml:space="preserve"> can be used to compare differences between commits.</w:t>
+      </w:r>
+    </w:p>
+    <w:p>
+      <w:pPr>
+        <w:tabs>
+          <w:tab w:val="left" w:pos="1216"/>
+        </w:tabs>
+        <w:rPr>
+          <w:sz w:val="18"/>
+          <w:szCs w:val="18"/>
+        </w:rPr>
+      </w:pPr>
+    </w:p>
+    <w:p>
+      <w:pPr>
+        <w:tabs>
+          <w:tab w:val="left" w:pos="1216"/>
+        </w:tabs>
+        <w:rPr>
+          <w:b/>
+          <w:bCs/>
+          <w:sz w:val="28"/>
+          <w:szCs w:val="28"/>
+        </w:rPr>
+      </w:pPr>
+      <w:r>
+        <w:rPr>
+          <w:b/>
+          <w:bCs/>
+          <w:sz w:val="28"/>
+          <w:szCs w:val="28"/>
+        </w:rPr>
+        <w:t xml:space="preserve">GitHub Repository </w:t>
+      </w:r>
+      <w:r>
+        <w:rPr>
+          <w:b/>
+          <w:bCs/>
+          <w:sz w:val="28"/>
+          <w:szCs w:val="28"/>
+        </w:rPr>
+        <w:t>L</w:t>
+      </w:r>
+      <w:r>
+        <w:rPr>
+          <w:b/>
+          <w:bCs/>
+          <w:sz w:val="28"/>
+          <w:szCs w:val="28"/>
+        </w:rPr>
+        <w:t>ink:</w:t>
+      </w:r>
+      <w:r>
+        <w:t xml:space="preserve"> </w:t>
+      </w:r>
+      <w:r>
+        <w:fldChar w:fldCharType="begin"/>
+      </w:r>
+      <w:r>
+        <w:instrText>HYPERLINK "https://github.com/Sb3ai/FC723-Portfolio-Project-1.git"</w:instrText>
+      </w:r>
+      <w:r>
+        <w:fldChar w:fldCharType="separate"/>
+      </w:r>
+      <w:r>
+        <w:rPr>
+          <w:rStyle w:val="Hyperlink"/>
+          <w:b/>
+          <w:bCs/>
+          <w:sz w:val="28"/>
+          <w:szCs w:val="28"/>
+        </w:rPr>
+        <w:t>https://github.com</w:t>
+      </w:r>
+      <w:r>
+        <w:rPr>
+          <w:rStyle w:val="Hyperlink"/>
+          <w:b/>
+          <w:bCs/>
+          <w:sz w:val="28"/>
+          <w:szCs w:val="28"/>
+        </w:rPr>
+        <w:t>/</w:t>
+      </w:r>
+      <w:r>
+        <w:rPr>
+          <w:rStyle w:val="Hyperlink"/>
+          <w:b/>
+          <w:bCs/>
+          <w:sz w:val="28"/>
+          <w:szCs w:val="28"/>
+        </w:rPr>
+        <w:t>Sb3ai/FC723-Portfolio-Project-1.git</w:t>
+      </w:r>
+      <w:r>
+        <w:fldChar w:fldCharType="end"/>
+      </w:r>
+    </w:p>
+    <w:p>
+      <w:pPr>
+        <w:tabs>
+          <w:tab w:val="left" w:pos="5207"/>
+        </w:tabs>
+        <w:rPr>
+          <w:sz w:val="18"/>
+          <w:szCs w:val="18"/>
+        </w:rPr>
+      </w:pPr>
     </w:p>
     <w:sectPr>
       <w:pgSz w:w="12240" w:h="15840"/>
@@ -2065,6 +2247,35 @@
       <w:u w:val="single"/>
     </w:rPr>
   </w:style>
+  <w:style w:type="paragraph" w:styleId="NormalWeb">
+    <w:name w:val="Normal (Web)"/>
+    <w:basedOn w:val="Normal"/>
+    <w:uiPriority w:val="99"/>
+    <w:semiHidden/>
+    <w:unhideWhenUsed/>
+    <w:rsid w:val="00EC654A"/>
+    <w:pPr>
+      <w:spacing w:before="100" w:beforeAutospacing="1" w:after="100" w:afterAutospacing="1" w:line="240" w:lineRule="auto"/>
+    </w:pPr>
+    <w:rPr>
+      <w:rFonts w:ascii="Times New Roman" w:eastAsia="Times New Roman" w:hAnsi="Times New Roman" w:cs="Times New Roman"/>
+      <w:kern w:val="0"/>
+      <w14:ligatures w14:val="none"/>
+    </w:rPr>
+  </w:style>
+  <w:style w:type="character" w:styleId="HTMLCode">
+    <w:name w:val="HTML Code"/>
+    <w:basedOn w:val="DefaultParagraphFont"/>
+    <w:uiPriority w:val="99"/>
+    <w:semiHidden/>
+    <w:unhideWhenUsed/>
+    <w:rsid w:val="00EC654A"/>
+    <w:rPr>
+      <w:rFonts w:ascii="Courier New" w:eastAsia="Times New Roman" w:hAnsi="Courier New" w:cs="Courier New"/>
+      <w:sz w:val="20"/>
+      <w:szCs w:val="20"/>
+    </w:rPr>
+  </w:style>
 </w:styles>
 </file>
 

</xml_diff>